<commit_message>
feat: add email and password accounts
- Sign-up upgrades the anonymous account (same id, progress kept);
  sign-in joins the phone's progress with the account; sign-out clears
  the phone; accounts for adults only until parental consent exists
- Account screen with theme switch; nudge on Progress; landing sign-in
- API routes for account status, sign-up, sign-in and sign-out with
  friendly errors; the email is never logged
- mergeProgress keeps everything learned on either side
- Minimum password length 8; higher local auth rate limits for tests
- Plans v0.3 record the order: email first, Google next, phone later
- Component test timeout 15 s (jsdom accessibility scans under coverage);
  long end-to-end journeys marked slow

Co-Authored-By: Claude Opus 5.5 <noreply@anthropic.com>
</commit_message>
<xml_diff>
--- a/docs/MedLearn_OS_Visual_UX_UI_Engineering_Plan_v0_3.docx
+++ b/docs/MedLearn_OS_Visual_UX_UI_Engineering_Plan_v0_3.docx
@@ -17827,7 +17827,7 @@
               <w:spacing w:after="40"/>
             </w:pPr>
             <w:r>
-              <w:t xml:space="preserve">Phone OTP sign-in that upgrades the anonymous account; parental consent for under-18 students; an offline queue for answers.</w:t>
+              <w:t xml:space="preserve">Email and password accounts: sign-up upgrades the anonymous account (same id, so saved progress stays), sign-in joins the phone’s progress with the account, sign-out clears the phone; an Account screen with the theme switch.</w:t>
             </w:r>
           </w:p>
         </w:tc>
@@ -17849,7 +17849,7 @@
               <w:spacing w:after="40"/>
             </w:pPr>
             <w:r>
-              <w:t xml:space="preserve">An SMS provider is chosen (for example MSG91 or Twilio) and the sender ID and message templates are registered on the Indian DLT platform, which operators require for OTP messages.</w:t>
+              <w:t xml:space="preserve">Sign-up, sign-in and sign-out pass integration and end-to-end tests. Google sign-in comes next; phone OTP after that, once an SMS provider is chosen and DLT registration is done.</w:t>
             </w:r>
           </w:p>
         </w:tc>
@@ -17872,6 +17872,72 @@
               <w:spacing w:after="40"/>
             </w:pPr>
             <w:r>
+              <w:t xml:space="preserve">M4b+</w:t>
+            </w:r>
+          </w:p>
+        </w:tc>
+        <w:tc>
+          <w:tcPr>
+            <w:tcW w:type="dxa" w:w="5480"/>
+            <w:vAlign w:val="top"/>
+            <w:tcBorders>
+              <w:top w:val="single" w:sz="4" w:color="D7DEE5"/>
+              <w:left w:val="single" w:sz="4" w:color="D7DEE5"/>
+              <w:bottom w:val="single" w:sz="4" w:color="D7DEE5"/>
+              <w:right w:val="single" w:sz="4" w:color="D7DEE5"/>
+            </w:tcBorders>
+          </w:tcPr>
+          <w:p>
+            <w:pPr>
+              <w:pStyle w:val="TableText"/>
+              <w:spacing w:after="40"/>
+            </w:pPr>
+            <w:r>
+              <w:t xml:space="preserve">Password reset and email confirmation; parental consent for under-18 students; an offline queue for answers.</w:t>
+            </w:r>
+          </w:p>
+        </w:tc>
+        <w:tc>
+          <w:tcPr>
+            <w:tcW w:type="dxa" w:w="3200"/>
+            <w:vAlign w:val="top"/>
+            <w:tcBorders>
+              <w:top w:val="single" w:sz="4" w:color="D7DEE5"/>
+              <w:left w:val="single" w:sz="4" w:color="D7DEE5"/>
+              <w:bottom w:val="single" w:sz="4" w:color="D7DEE5"/>
+              <w:right w:val="single" w:sz="4" w:color="D7DEE5"/>
+            </w:tcBorders>
+          </w:tcPr>
+          <w:p>
+            <w:pPr>
+              <w:pStyle w:val="TableText"/>
+              <w:spacing w:after="40"/>
+            </w:pPr>
+            <w:r>
+              <w:t xml:space="preserve">A transactional email service is connected (Supabase’s built-in email is for testing only).</w:t>
+            </w:r>
+          </w:p>
+        </w:tc>
+      </w:tr>
+      <w:tr>
+        <w:tc>
+          <w:tcPr>
+            <w:tcW w:type="dxa" w:w="1400"/>
+            <w:vAlign w:val="top"/>
+            <w:tcBorders>
+              <w:top w:val="single" w:sz="4" w:color="D7DEE5"/>
+              <w:left w:val="single" w:sz="4" w:color="D7DEE5"/>
+              <w:bottom w:val="single" w:sz="4" w:color="D7DEE5"/>
+              <w:right w:val="single" w:sz="4" w:color="D7DEE5"/>
+            </w:tcBorders>
+            <w:shd w:fill="F4F7F9"/>
+          </w:tcPr>
+          <w:p>
+            <w:pPr>
+              <w:pStyle w:val="TableText"/>
+              <w:spacing w:after="40"/>
+            </w:pPr>
+            <w:r>
               <w:t xml:space="preserve">M4c</w:t>
             </w:r>
           </w:p>
@@ -17886,6 +17952,7 @@
               <w:bottom w:val="single" w:sz="4" w:color="D7DEE5"/>
               <w:right w:val="single" w:sz="4" w:color="D7DEE5"/>
             </w:tcBorders>
+            <w:shd w:fill="F4F7F9"/>
           </w:tcPr>
           <w:p>
             <w:pPr>
@@ -17907,6 +17974,7 @@
               <w:bottom w:val="single" w:sz="4" w:color="D7DEE5"/>
               <w:right w:val="single" w:sz="4" w:color="D7DEE5"/>
             </w:tcBorders>
+            <w:shd w:fill="F4F7F9"/>
           </w:tcPr>
           <w:p>
             <w:pPr>
@@ -17920,6 +17988,18 @@
         </w:tc>
       </w:tr>
     </w:tbl>
+    <w:p>
+      <w:r>
+        <w:rPr>
+          <w:b/>
+          <w:color w:val="17324D"/>
+        </w:rPr>
+        <w:t xml:space="preserve">Sign-in order: </w:t>
+      </w:r>
+      <w:r>
+        <w:t xml:space="preserve">email and password now, Google next, phone OTP later (v0.2 planned phone OTP first). Sign-in runs through our server, so in production the auth rate limits must allow for many students behind one server, and our own per-student limits come first.</w:t>
+      </w:r>
+    </w:p>
     <w:p>
       <w:r>
         <w:rPr>
@@ -18918,6 +18998,79 @@
               <w:t xml:space="preserve">NEW v0.3  </w:t>
             </w:r>
             <w:r>
+              <w:t xml:space="preserve">Sign-in methods</w:t>
+            </w:r>
+          </w:p>
+        </w:tc>
+        <w:tc>
+          <w:tcPr>
+            <w:tcW w:type="dxa" w:w="5080"/>
+            <w:vAlign w:val="top"/>
+            <w:tcBorders>
+              <w:top w:val="single" w:sz="4" w:color="D7DEE5"/>
+              <w:left w:val="single" w:sz="4" w:color="D7DEE5"/>
+              <w:bottom w:val="single" w:sz="4" w:color="D7DEE5"/>
+              <w:right w:val="single" w:sz="4" w:color="D7DEE5"/>
+            </w:tcBorders>
+          </w:tcPr>
+          <w:p>
+            <w:pPr>
+              <w:pStyle w:val="TableText"/>
+              <w:spacing w:after="40"/>
+            </w:pPr>
+            <w:r>
+              <w:t xml:space="preserve">Email and password first; Google next; phone OTP after that</w:t>
+            </w:r>
+          </w:p>
+        </w:tc>
+        <w:tc>
+          <w:tcPr>
+            <w:tcW w:type="dxa" w:w="2400"/>
+            <w:vAlign w:val="top"/>
+            <w:tcBorders>
+              <w:top w:val="single" w:sz="4" w:color="D7DEE5"/>
+              <w:left w:val="single" w:sz="4" w:color="D7DEE5"/>
+              <w:bottom w:val="single" w:sz="4" w:color="D7DEE5"/>
+              <w:right w:val="single" w:sz="4" w:color="D7DEE5"/>
+            </w:tcBorders>
+          </w:tcPr>
+          <w:p>
+            <w:pPr>
+              <w:pStyle w:val="TableText"/>
+              <w:spacing w:after="40"/>
+            </w:pPr>
+            <w:r>
+              <w:t xml:space="preserve">Chosen</w:t>
+            </w:r>
+          </w:p>
+        </w:tc>
+      </w:tr>
+      <w:tr>
+        <w:tc>
+          <w:tcPr>
+            <w:tcW w:type="dxa" w:w="2600"/>
+            <w:vAlign w:val="top"/>
+            <w:tcBorders>
+              <w:top w:val="single" w:sz="4" w:color="D7DEE5"/>
+              <w:left w:val="single" w:sz="4" w:color="D7DEE5"/>
+              <w:bottom w:val="single" w:sz="4" w:color="D7DEE5"/>
+              <w:right w:val="single" w:sz="4" w:color="D7DEE5"/>
+            </w:tcBorders>
+            <w:shd w:fill="F4F7F9"/>
+          </w:tcPr>
+          <w:p>
+            <w:pPr>
+              <w:pStyle w:val="TableText"/>
+              <w:spacing w:after="40"/>
+            </w:pPr>
+            <w:r>
+              <w:rPr>
+                <w:b/>
+                <w:color w:val="0E7C86"/>
+              </w:rPr>
+              <w:t xml:space="preserve">NEW v0.3  </w:t>
+            </w:r>
+            <w:r>
               <w:t xml:space="preserve">SMS provider for OTP</w:t>
             </w:r>
           </w:p>
@@ -18932,14 +19085,15 @@
               <w:bottom w:val="single" w:sz="4" w:color="D7DEE5"/>
               <w:right w:val="single" w:sz="4" w:color="D7DEE5"/>
             </w:tcBorders>
-          </w:tcPr>
-          <w:p>
-            <w:pPr>
-              <w:pStyle w:val="TableText"/>
-              <w:spacing w:after="40"/>
-            </w:pPr>
-            <w:r>
-              <w:t xml:space="preserve">MSG91 or Twilio, with DLT registration</w:t>
+            <w:shd w:fill="F4F7F9"/>
+          </w:tcPr>
+          <w:p>
+            <w:pPr>
+              <w:pStyle w:val="TableText"/>
+              <w:spacing w:after="40"/>
+            </w:pPr>
+            <w:r>
+              <w:t xml:space="preserve">MSG91 or Twilio, with DLT registration; needed only when phone sign-in starts</w:t>
             </w:r>
           </w:p>
         </w:tc>
@@ -18953,14 +19107,87 @@
               <w:bottom w:val="single" w:sz="4" w:color="D7DEE5"/>
               <w:right w:val="single" w:sz="4" w:color="D7DEE5"/>
             </w:tcBorders>
-          </w:tcPr>
-          <w:p>
-            <w:pPr>
-              <w:pStyle w:val="TableText"/>
-              <w:spacing w:after="40"/>
-            </w:pPr>
-            <w:r>
-              <w:t xml:space="preserve">To decide in M4b</w:t>
+            <w:shd w:fill="F4F7F9"/>
+          </w:tcPr>
+          <w:p>
+            <w:pPr>
+              <w:pStyle w:val="TableText"/>
+              <w:spacing w:after="40"/>
+            </w:pPr>
+            <w:r>
+              <w:t xml:space="preserve">To decide later</w:t>
+            </w:r>
+          </w:p>
+        </w:tc>
+      </w:tr>
+      <w:tr>
+        <w:tc>
+          <w:tcPr>
+            <w:tcW w:type="dxa" w:w="2600"/>
+            <w:vAlign w:val="top"/>
+            <w:tcBorders>
+              <w:top w:val="single" w:sz="4" w:color="D7DEE5"/>
+              <w:left w:val="single" w:sz="4" w:color="D7DEE5"/>
+              <w:bottom w:val="single" w:sz="4" w:color="D7DEE5"/>
+              <w:right w:val="single" w:sz="4" w:color="D7DEE5"/>
+            </w:tcBorders>
+          </w:tcPr>
+          <w:p>
+            <w:pPr>
+              <w:pStyle w:val="TableText"/>
+              <w:spacing w:after="40"/>
+            </w:pPr>
+            <w:r>
+              <w:rPr>
+                <w:b/>
+                <w:color w:val="0E7C86"/>
+              </w:rPr>
+              <w:t xml:space="preserve">NEW v0.3  </w:t>
+            </w:r>
+            <w:r>
+              <w:t xml:space="preserve">Email service</w:t>
+            </w:r>
+          </w:p>
+        </w:tc>
+        <w:tc>
+          <w:tcPr>
+            <w:tcW w:type="dxa" w:w="5080"/>
+            <w:vAlign w:val="top"/>
+            <w:tcBorders>
+              <w:top w:val="single" w:sz="4" w:color="D7DEE5"/>
+              <w:left w:val="single" w:sz="4" w:color="D7DEE5"/>
+              <w:bottom w:val="single" w:sz="4" w:color="D7DEE5"/>
+              <w:right w:val="single" w:sz="4" w:color="D7DEE5"/>
+            </w:tcBorders>
+          </w:tcPr>
+          <w:p>
+            <w:pPr>
+              <w:pStyle w:val="TableText"/>
+              <w:spacing w:after="40"/>
+            </w:pPr>
+            <w:r>
+              <w:t xml:space="preserve">A transactional email provider for confirmation and password reset (free tiers exist)</w:t>
+            </w:r>
+          </w:p>
+        </w:tc>
+        <w:tc>
+          <w:tcPr>
+            <w:tcW w:type="dxa" w:w="2400"/>
+            <w:vAlign w:val="top"/>
+            <w:tcBorders>
+              <w:top w:val="single" w:sz="4" w:color="D7DEE5"/>
+              <w:left w:val="single" w:sz="4" w:color="D7DEE5"/>
+              <w:bottom w:val="single" w:sz="4" w:color="D7DEE5"/>
+              <w:right w:val="single" w:sz="4" w:color="D7DEE5"/>
+            </w:tcBorders>
+          </w:tcPr>
+          <w:p>
+            <w:pPr>
+              <w:pStyle w:val="TableText"/>
+              <w:spacing w:after="40"/>
+            </w:pPr>
+            <w:r>
+              <w:t xml:space="preserve">To decide before the pilot</w:t>
             </w:r>
           </w:p>
         </w:tc>

</xml_diff>